<commit_message>
Harden and verify full BUILI workflows
</commit_message>
<xml_diff>
--- a/buili_demo_evidence/BUI-1042-issue-package.docx
+++ b/buili_demo_evidence/BUI-1042-issue-package.docx
@@ -683,8 +683,8 @@
         <w:tblInd w:w="120" w:type="dxa"/>
       </w:tblPr>
       <w:tblGrid>
-        <w:gridCol w:w="1300"/>
-        <w:gridCol w:w="5100"/>
+        <w:gridCol w:w="1600"/>
+        <w:gridCol w:w="4800"/>
         <w:gridCol w:w="2960"/>
       </w:tblGrid>
       <w:tr>
@@ -693,7 +693,7 @@
         </w:trPr>
         <w:tc>
           <w:tcPr>
-            <w:tcW w:type="dxa" w:w="1300"/>
+            <w:tcW w:type="dxa" w:w="1600"/>
             <w:tcMar>
               <w:top w:w="90" w:type="dxa"/>
               <w:start w:w="110" w:type="dxa"/>
@@ -723,7 +723,7 @@
         </w:tc>
         <w:tc>
           <w:tcPr>
-            <w:tcW w:type="dxa" w:w="5100"/>
+            <w:tcW w:type="dxa" w:w="4800"/>
             <w:tcMar>
               <w:top w:w="90" w:type="dxa"/>
               <w:start w:w="110" w:type="dxa"/>
@@ -785,7 +785,7 @@
       <w:tr>
         <w:tc>
           <w:tcPr>
-            <w:tcW w:type="dxa" w:w="1300"/>
+            <w:tcW w:type="dxa" w:w="1600"/>
             <w:tcMar>
               <w:top w:w="90" w:type="dxa"/>
               <w:start w:w="110" w:type="dxa"/>
@@ -814,7 +814,7 @@
         </w:tc>
         <w:tc>
           <w:tcPr>
-            <w:tcW w:type="dxa" w:w="5100"/>
+            <w:tcW w:type="dxa" w:w="4800"/>
             <w:tcMar>
               <w:top w:w="90" w:type="dxa"/>
               <w:start w:w="110" w:type="dxa"/>
@@ -874,7 +874,7 @@
       <w:tr>
         <w:tc>
           <w:tcPr>
-            <w:tcW w:type="dxa" w:w="1300"/>
+            <w:tcW w:type="dxa" w:w="1600"/>
             <w:tcMar>
               <w:top w:w="90" w:type="dxa"/>
               <w:start w:w="110" w:type="dxa"/>
@@ -903,7 +903,7 @@
         </w:tc>
         <w:tc>
           <w:tcPr>
-            <w:tcW w:type="dxa" w:w="5100"/>
+            <w:tcW w:type="dxa" w:w="4800"/>
             <w:tcMar>
               <w:top w:w="90" w:type="dxa"/>
               <w:start w:w="110" w:type="dxa"/>
@@ -963,7 +963,7 @@
       <w:tr>
         <w:tc>
           <w:tcPr>
-            <w:tcW w:type="dxa" w:w="1300"/>
+            <w:tcW w:type="dxa" w:w="1600"/>
             <w:tcMar>
               <w:top w:w="90" w:type="dxa"/>
               <w:start w:w="110" w:type="dxa"/>
@@ -992,7 +992,7 @@
         </w:tc>
         <w:tc>
           <w:tcPr>
-            <w:tcW w:type="dxa" w:w="5100"/>
+            <w:tcW w:type="dxa" w:w="4800"/>
             <w:tcMar>
               <w:top w:w="90" w:type="dxa"/>
               <w:start w:w="110" w:type="dxa"/>
@@ -1067,7 +1067,7 @@
         <w:drawing>
           <wp:inline xmlns:a="http://schemas.openxmlformats.org/drawingml/2006/main" xmlns:pic="http://schemas.openxmlformats.org/drawingml/2006/picture">
             <wp:extent cx="4389120" cy="3291840"/>
-            <wp:docPr id="1" name="Picture 1"/>
+            <wp:docPr id="1" name="Picture 1" descr="Garage east wall context. Building: Residence / Space: Garage / Wall: East wall / Near: Entry door" title="Garage east wall context"/>
             <wp:cNvGraphicFramePr>
               <a:graphicFrameLocks noChangeAspect="1"/>
             </wp:cNvGraphicFramePr>
@@ -1123,7 +1123,7 @@
         <w:drawing>
           <wp:inline xmlns:a="http://schemas.openxmlformats.org/drawingml/2006/main" xmlns:pic="http://schemas.openxmlformats.org/drawingml/2006/picture">
             <wp:extent cx="4389120" cy="3291840"/>
-            <wp:docPr id="2" name="Picture 2"/>
+            <wp:docPr id="2" name="Picture 2" descr="GFCI centerline tape measurement. Building: Residence / Space: Garage / Wall: East wall / Near: Entry door" title="GFCI centerline tape measurement"/>
             <wp:cNvGraphicFramePr>
               <a:graphicFrameLocks noChangeAspect="1"/>
             </wp:cNvGraphicFramePr>
@@ -1179,7 +1179,7 @@
         <w:drawing>
           <wp:inline xmlns:a="http://schemas.openxmlformats.org/drawingml/2006/main" xmlns:pic="http://schemas.openxmlformats.org/drawingml/2006/picture">
             <wp:extent cx="4389120" cy="3291840"/>
-            <wp:docPr id="3" name="Picture 3"/>
+            <wp:docPr id="3" name="Picture 3" descr="Receptacle rough-in detail. Building: Residence / Space: Garage / Wall: East wall / Near: Entry door" title="Receptacle rough-in detail"/>
             <wp:cNvGraphicFramePr>
               <a:graphicFrameLocks noChangeAspect="1"/>
             </wp:cNvGraphicFramePr>
@@ -1449,7 +1449,7 @@
                 <w:color w:val="17211B"/>
                 <w:sz w:val="17"/>
               </w:rPr>
-              <w:t>E1.1 / Rev IFC-1 / APPROVED SHA-256: 50be9d19503471862a14e1383cbb5c4cf04a8cd97c237521cc324221e104bec1</w:t>
+              <w:t>E1.1 / Rev 2 / APPROVED SHA-256: f6b74c9a632092bcd911a2486d2601a3b73442f6358d9e5916de584edc5f710b</w:t>
             </w:r>
           </w:p>
         </w:tc>
@@ -1812,90 +1812,45 @@
   <w:p>
     <w:pPr>
       <w:pStyle w:val="Footer"/>
-    </w:pPr>
+      <w:tabs>
+        <w:tab w:pos="9360" w:val="right"/>
+      </w:tabs>
+      <w:spacing w:after="0"/>
+    </w:pPr>
+    <w:r>
+      <w:rPr>
+        <w:rFonts w:ascii="Arial" w:hAnsi="Arial"/>
+        <w:b w:val="0"/>
+        <w:i w:val="0"/>
+        <w:color w:val="667069"/>
+        <w:sz w:val="15"/>
+      </w:rPr>
+      <w:t>SOURCE-CITED REVIEW RECORD</w:t>
+    </w:r>
+    <w:r>
+      <w:rPr>
+        <w:rFonts w:ascii="Arial" w:hAnsi="Arial"/>
+        <w:b w:val="0"/>
+        <w:i w:val="0"/>
+        <w:color w:val="667069"/>
+        <w:sz w:val="16"/>
+      </w:rPr>
+      <w:tab/>
+      <w:t xml:space="preserve">Page </w:t>
+    </w:r>
+    <w:r>
+      <w:rPr>
+        <w:rFonts w:ascii="Arial" w:hAnsi="Arial"/>
+        <w:b w:val="0"/>
+        <w:i w:val="0"/>
+        <w:color w:val="667069"/>
+        <w:sz w:val="16"/>
+      </w:rPr>
+      <w:fldChar w:fldCharType="begin"/>
+      <w:instrText xml:space="preserve"> PAGE </w:instrText>
+      <w:fldChar w:fldCharType="end"/>
+    </w:r>
   </w:p>
-  <w:tbl>
-    <w:tblPr>
-      <w:tblW w:type="dxa" w:w="9360"/>
-      <w:jc w:val="left"/>
-      <w:tblLayout w:type="fixed"/>
-      <w:tblLook w:firstColumn="1" w:firstRow="1" w:lastColumn="0" w:lastRow="0" w:noHBand="0" w:noVBand="1" w:val="04A0"/>
-      <w:tblInd w:w="120" w:type="dxa"/>
-    </w:tblPr>
-    <w:tblGrid>
-      <w:gridCol w:w="6800"/>
-      <w:gridCol w:w="2560"/>
-    </w:tblGrid>
-    <w:tr>
-      <w:tc>
-        <w:tcPr>
-          <w:tcW w:type="dxa" w:w="6800"/>
-          <w:tcMar>
-            <w:top w:w="90" w:type="dxa"/>
-            <w:start w:w="110" w:type="dxa"/>
-            <w:bottom w:w="90" w:type="dxa"/>
-            <w:end w:w="110" w:type="dxa"/>
-          </w:tcMar>
-          <w:vAlign w:val="center"/>
-        </w:tcPr>
-        <w:p>
-          <w:pPr>
-            <w:spacing w:before="0" w:after="0" w:line="269" w:lineRule="auto"/>
-            <w:jc w:val="left"/>
-          </w:pPr>
-          <w:r/>
-          <w:r>
-            <w:rPr>
-              <w:rFonts w:ascii="Arial" w:hAnsi="Arial"/>
-              <w:b w:val="0"/>
-              <w:i w:val="0"/>
-              <w:color w:val="667069"/>
-              <w:sz w:val="15"/>
-            </w:rPr>
-            <w:t>SOURCE-CITED REVIEW RECORD</w:t>
-          </w:r>
-        </w:p>
-      </w:tc>
-      <w:tc>
-        <w:tcPr>
-          <w:tcW w:type="dxa" w:w="2560"/>
-          <w:tcMar>
-            <w:top w:w="90" w:type="dxa"/>
-            <w:start w:w="110" w:type="dxa"/>
-            <w:bottom w:w="90" w:type="dxa"/>
-            <w:end w:w="110" w:type="dxa"/>
-          </w:tcMar>
-        </w:tcPr>
-        <w:p>
-          <w:pPr>
-            <w:jc w:val="right"/>
-          </w:pPr>
-          <w:r>
-            <w:rPr>
-              <w:rFonts w:ascii="Arial" w:hAnsi="Arial"/>
-              <w:b w:val="0"/>
-              <w:i w:val="0"/>
-              <w:color w:val="667069"/>
-              <w:sz w:val="16"/>
-            </w:rPr>
-            <w:t xml:space="preserve">Page </w:t>
-          </w:r>
-          <w:r>
-            <w:rPr>
-              <w:rFonts w:ascii="Arial" w:hAnsi="Arial"/>
-              <w:b w:val="0"/>
-              <w:i w:val="0"/>
-              <w:color w:val="667069"/>
-              <w:sz w:val="16"/>
-            </w:rPr>
-            <w:fldChar w:fldCharType="begin"/>
-            <w:instrText xml:space="preserve"> PAGE </w:instrText>
-            <w:fldChar w:fldCharType="end"/>
-          </w:r>
-        </w:p>
-      </w:tc>
-    </w:tr>
-  </w:tbl>
 </w:ftr>
 </file>
 

</xml_diff>